<commit_message>
Thêm APIs ví và ngân sách (wallets và budgets), chỉnh một số file
- Thêm budgets.py, wallets.py
- Xóa hàm thừa trong main.py
- Thêm logic cập nhật số dư ví khi thực hiện giao dịch trong transactions.py
- Sửa nhẹ file báo cáo
</commit_message>
<xml_diff>
--- a/App quản lý chi tiêu cá nhân.docx
+++ b/App quản lý chi tiêu cá nhân.docx
@@ -1,6 +1,6 @@
 
 <file path=word/document.xml><?xml version="1.0" encoding="utf-8"?>
-<w:document xmlns:wpc="http://schemas.microsoft.com/office/word/2010/wordprocessingCanvas" xmlns:cx="http://schemas.microsoft.com/office/drawing/2014/chartex" xmlns:cx1="http://schemas.microsoft.com/office/drawing/2015/9/8/chartex" xmlns:cx2="http://schemas.microsoft.com/office/drawing/2015/10/21/chartex" xmlns:cx3="http://schemas.microsoft.com/office/drawing/2016/5/9/chartex" xmlns:cx4="http://schemas.microsoft.com/office/drawing/2016/5/10/chartex" xmlns:cx5="http://schemas.microsoft.com/office/drawing/2016/5/11/chartex" xmlns:cx6="http://schemas.microsoft.com/office/drawing/2016/5/12/chartex" xmlns:cx7="http://schemas.microsoft.com/office/drawing/2016/5/13/chartex" xmlns:cx8="http://schemas.microsoft.com/office/drawing/2016/5/14/chartex" xmlns:mc="http://schemas.openxmlformats.org/markup-compatibility/2006" xmlns:aink="http://schemas.microsoft.com/office/drawing/2016/ink" xmlns:am3d="http://schemas.microsoft.com/office/drawing/2017/model3d" xmlns:o="urn:schemas-microsoft-com:office:office" xmlns:oel="http://schemas.microsoft.com/office/2019/extlst" xmlns:r="http://schemas.openxmlformats.org/officeDocument/2006/relationships" xmlns:m="http://schemas.openxmlformats.org/officeDocument/2006/math" xmlns:v="urn:schemas-microsoft-com:vml" xmlns:wp14="http://schemas.microsoft.com/office/word/2010/wordprocessingDrawing" xmlns:wp="http://schemas.openxmlformats.org/drawingml/2006/wordprocessingDrawing" xmlns:w10="urn:schemas-microsoft-com:office:word" xmlns:w="http://schemas.openxmlformats.org/wordprocessingml/2006/main" xmlns:w14="http://schemas.microsoft.com/office/word/2010/wordml" xmlns:w15="http://schemas.microsoft.com/office/word/2012/wordml" xmlns:w16cex="http://schemas.microsoft.com/office/word/2018/wordml/cex" xmlns:w16cid="http://schemas.microsoft.com/office/word/2016/wordml/cid" xmlns:w16="http://schemas.microsoft.com/office/word/2018/wordml" xmlns:w16sdtdh="http://schemas.microsoft.com/office/word/2020/wordml/sdtdatahash" xmlns:w16se="http://schemas.microsoft.com/office/word/2015/wordml/symex" xmlns:wpg="http://schemas.microsoft.com/office/word/2010/wordprocessingGroup" xmlns:wpi="http://schemas.microsoft.com/office/word/2010/wordprocessingInk" xmlns:wne="http://schemas.microsoft.com/office/word/2006/wordml" xmlns:wps="http://schemas.microsoft.com/office/word/2010/wordprocessingShape" mc:Ignorable="w14 w15 w16se w16cid w16 w16cex w16sdtdh wp14">
+<w:document xmlns:wpc="http://schemas.microsoft.com/office/word/2010/wordprocessingCanvas" xmlns:cx="http://schemas.microsoft.com/office/drawing/2014/chartex" xmlns:cx1="http://schemas.microsoft.com/office/drawing/2015/9/8/chartex" xmlns:cx2="http://schemas.microsoft.com/office/drawing/2015/10/21/chartex" xmlns:cx3="http://schemas.microsoft.com/office/drawing/2016/5/9/chartex" xmlns:cx4="http://schemas.microsoft.com/office/drawing/2016/5/10/chartex" xmlns:cx5="http://schemas.microsoft.com/office/drawing/2016/5/11/chartex" xmlns:cx6="http://schemas.microsoft.com/office/drawing/2016/5/12/chartex" xmlns:cx7="http://schemas.microsoft.com/office/drawing/2016/5/13/chartex" xmlns:cx8="http://schemas.microsoft.com/office/drawing/2016/5/14/chartex" xmlns:mc="http://schemas.openxmlformats.org/markup-compatibility/2006" xmlns:aink="http://schemas.microsoft.com/office/drawing/2016/ink" xmlns:am3d="http://schemas.microsoft.com/office/drawing/2017/model3d" xmlns:o="urn:schemas-microsoft-com:office:office" xmlns:oel="http://schemas.microsoft.com/office/2019/extlst" xmlns:r="http://schemas.openxmlformats.org/officeDocument/2006/relationships" xmlns:m="http://schemas.openxmlformats.org/officeDocument/2006/math" xmlns:v="urn:schemas-microsoft-com:vml" xmlns:wp14="http://schemas.microsoft.com/office/word/2010/wordprocessingDrawing" xmlns:wp="http://schemas.openxmlformats.org/drawingml/2006/wordprocessingDrawing" xmlns:w10="urn:schemas-microsoft-com:office:word" xmlns:w="http://schemas.openxmlformats.org/wordprocessingml/2006/main" xmlns:w14="http://schemas.microsoft.com/office/word/2010/wordml" xmlns:w15="http://schemas.microsoft.com/office/word/2012/wordml" xmlns:w16cex="http://schemas.microsoft.com/office/word/2018/wordml/cex" xmlns:w16cid="http://schemas.microsoft.com/office/word/2016/wordml/cid" xmlns:w16="http://schemas.microsoft.com/office/word/2018/wordml" xmlns:w16du="http://schemas.microsoft.com/office/word/2023/wordml/word16du" xmlns:w16sdtdh="http://schemas.microsoft.com/office/word/2020/wordml/sdtdatahash" xmlns:w16sdtfl="http://schemas.microsoft.com/office/word/2024/wordml/sdtformatlock" xmlns:w16se="http://schemas.microsoft.com/office/word/2015/wordml/symex" xmlns:wpg="http://schemas.microsoft.com/office/word/2010/wordprocessingGroup" xmlns:wpi="http://schemas.microsoft.com/office/word/2010/wordprocessingInk" xmlns:wne="http://schemas.microsoft.com/office/word/2006/wordml" xmlns:wps="http://schemas.microsoft.com/office/word/2010/wordprocessingShape" mc:Ignorable="w14 w15 w16se w16cid w16 w16cex w16sdtdh w16sdtfl w16du wp14">
   <w:body>
     <w:p>
       <w:pPr>
@@ -61,7 +61,7 @@
           <w:b/>
           <w:bCs/>
         </w:rPr>
-        <w:t>Quản lý giao dịch(CRUD):</w:t>
+        <w:t>Quản lý giao dịch:</w:t>
       </w:r>
       <w:r>
         <w:t xml:space="preserve"> Có thể thêm, xem, sửa, xóa các khoản thu và chi</w:t>
@@ -84,6 +84,11 @@
       </w:r>
     </w:p>
     <w:p>
+      <w:pPr>
+        <w:rPr>
+          <w:lang w:val="en-US"/>
+        </w:rPr>
+      </w:pPr>
       <w:r>
         <w:tab/>
         <w:t xml:space="preserve">+ </w:t>
@@ -99,7 +104,6 @@
         <w:t xml:space="preserve"> Biểu đồ tổng thu tổng chi, Số dư hiện tại, biểu đồ cột so sánh thu chi theo tuần/tháng</w:t>
       </w:r>
     </w:p>
-    <w:p/>
     <w:p>
       <w:pPr>
         <w:numPr>
@@ -148,6 +152,66 @@
       </w:r>
       <w:r>
         <w:t xml:space="preserve"> Cho phép tạo nhiều ví như tiền mặt, ví bank, ví momo</w:t>
+      </w:r>
+      <w:r>
+        <w:rPr>
+          <w:lang w:val="en-US"/>
+        </w:rPr>
+        <w:t>. Kết hợp với chức năng “Danh mục chi tiêu”</w:t>
+      </w:r>
+      <w:r>
+        <w:rPr>
+          <w:lang w:val="en-US"/>
+        </w:rPr>
+        <w:t>, m</w:t>
+      </w:r>
+      <w:r>
+        <w:t xml:space="preserve">ỗi khi phát sinh một khoản thu/chi, người dùng </w:t>
+      </w:r>
+      <w:r>
+        <w:rPr>
+          <w:lang w:val="en-US"/>
+        </w:rPr>
+        <w:t>có thể quản lý được</w:t>
+      </w:r>
+      <w:r>
+        <w:t xml:space="preserve"> khoản tiền đó thuộc </w:t>
+      </w:r>
+      <w:r>
+        <w:rPr>
+          <w:b/>
+          <w:bCs/>
+          <w:lang w:val="en-US"/>
+        </w:rPr>
+        <w:t>d</w:t>
+      </w:r>
+      <w:r>
+        <w:rPr>
+          <w:b/>
+          <w:bCs/>
+        </w:rPr>
+        <w:t>anh mục</w:t>
+      </w:r>
+      <w:r>
+        <w:t xml:space="preserve"> nào và được trích xuất từ/nạp vào </w:t>
+      </w:r>
+      <w:r>
+        <w:rPr>
+          <w:b/>
+          <w:bCs/>
+          <w:lang w:val="en-US"/>
+        </w:rPr>
+        <w:t>v</w:t>
+      </w:r>
+      <w:r>
+        <w:rPr>
+          <w:b/>
+          <w:bCs/>
+        </w:rPr>
+        <w:t>í</w:t>
+      </w:r>
+      <w:r>
+        <w:t xml:space="preserve"> nào</w:t>
       </w:r>
     </w:p>
     <w:p>
@@ -445,6 +509,7 @@
         </w:numPr>
       </w:pPr>
       <w:r>
+        <w:lastRenderedPageBreak/>
         <w:t xml:space="preserve">Tích hợp thư viện </w:t>
       </w:r>
       <w:r>
@@ -476,7 +541,6 @@
         </w:numPr>
       </w:pPr>
       <w:r>
-        <w:lastRenderedPageBreak/>
         <w:t>Vẽ biểu đồ tròn (Pie chart) tổng thu/chi và biểu đồ cột (Bar chart) so sánh theo tuần/tháng.</w:t>
       </w:r>
     </w:p>
@@ -867,7 +931,7 @@
 </file>
 
 <file path=word/numbering.xml><?xml version="1.0" encoding="utf-8"?>
-<w:numbering xmlns:wpc="http://schemas.microsoft.com/office/word/2010/wordprocessingCanvas" xmlns:cx="http://schemas.microsoft.com/office/drawing/2014/chartex" xmlns:cx1="http://schemas.microsoft.com/office/drawing/2015/9/8/chartex" xmlns:cx2="http://schemas.microsoft.com/office/drawing/2015/10/21/chartex" xmlns:cx3="http://schemas.microsoft.com/office/drawing/2016/5/9/chartex" xmlns:cx4="http://schemas.microsoft.com/office/drawing/2016/5/10/chartex" xmlns:cx5="http://schemas.microsoft.com/office/drawing/2016/5/11/chartex" xmlns:cx6="http://schemas.microsoft.com/office/drawing/2016/5/12/chartex" xmlns:cx7="http://schemas.microsoft.com/office/drawing/2016/5/13/chartex" xmlns:cx8="http://schemas.microsoft.com/office/drawing/2016/5/14/chartex" xmlns:mc="http://schemas.openxmlformats.org/markup-compatibility/2006" xmlns:aink="http://schemas.microsoft.com/office/drawing/2016/ink" xmlns:am3d="http://schemas.microsoft.com/office/drawing/2017/model3d" xmlns:o="urn:schemas-microsoft-com:office:office" xmlns:oel="http://schemas.microsoft.com/office/2019/extlst" xmlns:r="http://schemas.openxmlformats.org/officeDocument/2006/relationships" xmlns:m="http://schemas.openxmlformats.org/officeDocument/2006/math" xmlns:v="urn:schemas-microsoft-com:vml" xmlns:wp14="http://schemas.microsoft.com/office/word/2010/wordprocessingDrawing" xmlns:wp="http://schemas.openxmlformats.org/drawingml/2006/wordprocessingDrawing" xmlns:w10="urn:schemas-microsoft-com:office:word" xmlns:w="http://schemas.openxmlformats.org/wordprocessingml/2006/main" xmlns:w14="http://schemas.microsoft.com/office/word/2010/wordml" xmlns:w15="http://schemas.microsoft.com/office/word/2012/wordml" xmlns:w16cex="http://schemas.microsoft.com/office/word/2018/wordml/cex" xmlns:w16cid="http://schemas.microsoft.com/office/word/2016/wordml/cid" xmlns:w16="http://schemas.microsoft.com/office/word/2018/wordml" xmlns:w16sdtdh="http://schemas.microsoft.com/office/word/2020/wordml/sdtdatahash" xmlns:w16se="http://schemas.microsoft.com/office/word/2015/wordml/symex" xmlns:wpg="http://schemas.microsoft.com/office/word/2010/wordprocessingGroup" xmlns:wpi="http://schemas.microsoft.com/office/word/2010/wordprocessingInk" xmlns:wne="http://schemas.microsoft.com/office/word/2006/wordml" xmlns:wps="http://schemas.microsoft.com/office/word/2010/wordprocessingShape" mc:Ignorable="w14 w15 w16se w16cid w16 w16cex w16sdtdh wp14">
+<w:numbering xmlns:wpc="http://schemas.microsoft.com/office/word/2010/wordprocessingCanvas" xmlns:cx="http://schemas.microsoft.com/office/drawing/2014/chartex" xmlns:cx1="http://schemas.microsoft.com/office/drawing/2015/9/8/chartex" xmlns:cx2="http://schemas.microsoft.com/office/drawing/2015/10/21/chartex" xmlns:cx3="http://schemas.microsoft.com/office/drawing/2016/5/9/chartex" xmlns:cx4="http://schemas.microsoft.com/office/drawing/2016/5/10/chartex" xmlns:cx5="http://schemas.microsoft.com/office/drawing/2016/5/11/chartex" xmlns:cx6="http://schemas.microsoft.com/office/drawing/2016/5/12/chartex" xmlns:cx7="http://schemas.microsoft.com/office/drawing/2016/5/13/chartex" xmlns:cx8="http://schemas.microsoft.com/office/drawing/2016/5/14/chartex" xmlns:mc="http://schemas.openxmlformats.org/markup-compatibility/2006" xmlns:aink="http://schemas.microsoft.com/office/drawing/2016/ink" xmlns:am3d="http://schemas.microsoft.com/office/drawing/2017/model3d" xmlns:o="urn:schemas-microsoft-com:office:office" xmlns:oel="http://schemas.microsoft.com/office/2019/extlst" xmlns:r="http://schemas.openxmlformats.org/officeDocument/2006/relationships" xmlns:m="http://schemas.openxmlformats.org/officeDocument/2006/math" xmlns:v="urn:schemas-microsoft-com:vml" xmlns:wp14="http://schemas.microsoft.com/office/word/2010/wordprocessingDrawing" xmlns:wp="http://schemas.openxmlformats.org/drawingml/2006/wordprocessingDrawing" xmlns:w10="urn:schemas-microsoft-com:office:word" xmlns:w="http://schemas.openxmlformats.org/wordprocessingml/2006/main" xmlns:w14="http://schemas.microsoft.com/office/word/2010/wordml" xmlns:w15="http://schemas.microsoft.com/office/word/2012/wordml" xmlns:w16cex="http://schemas.microsoft.com/office/word/2018/wordml/cex" xmlns:w16cid="http://schemas.microsoft.com/office/word/2016/wordml/cid" xmlns:w16="http://schemas.microsoft.com/office/word/2018/wordml" xmlns:w16du="http://schemas.microsoft.com/office/word/2023/wordml/word16du" xmlns:w16sdtdh="http://schemas.microsoft.com/office/word/2020/wordml/sdtdatahash" xmlns:w16sdtfl="http://schemas.microsoft.com/office/word/2024/wordml/sdtformatlock" xmlns:w16se="http://schemas.microsoft.com/office/word/2015/wordml/symex" xmlns:wpg="http://schemas.microsoft.com/office/word/2010/wordprocessingGroup" xmlns:wpi="http://schemas.microsoft.com/office/word/2010/wordprocessingInk" xmlns:wne="http://schemas.microsoft.com/office/word/2006/wordml" xmlns:wps="http://schemas.microsoft.com/office/word/2010/wordprocessingShape" mc:Ignorable="w14 w15 w16se w16cid w16 w16cex w16sdtdh w16sdtfl w16du wp14">
   <w:abstractNum w:abstractNumId="0" w15:restartNumberingAfterBreak="0">
     <w:nsid w:val="00421BB4"/>
     <w:multiLevelType w:val="multilevel"/>
@@ -2032,7 +2096,7 @@
 </file>
 
 <file path=word/styles.xml><?xml version="1.0" encoding="utf-8"?>
-<w:styles xmlns:mc="http://schemas.openxmlformats.org/markup-compatibility/2006" xmlns:r="http://schemas.openxmlformats.org/officeDocument/2006/relationships" xmlns:w="http://schemas.openxmlformats.org/wordprocessingml/2006/main" xmlns:w14="http://schemas.microsoft.com/office/word/2010/wordml" xmlns:w15="http://schemas.microsoft.com/office/word/2012/wordml" xmlns:w16cex="http://schemas.microsoft.com/office/word/2018/wordml/cex" xmlns:w16cid="http://schemas.microsoft.com/office/word/2016/wordml/cid" xmlns:w16="http://schemas.microsoft.com/office/word/2018/wordml" xmlns:w16sdtdh="http://schemas.microsoft.com/office/word/2020/wordml/sdtdatahash" xmlns:w16se="http://schemas.microsoft.com/office/word/2015/wordml/symex" mc:Ignorable="w14 w15 w16se w16cid w16 w16cex w16sdtdh">
+<w:styles xmlns:mc="http://schemas.openxmlformats.org/markup-compatibility/2006" xmlns:r="http://schemas.openxmlformats.org/officeDocument/2006/relationships" xmlns:w="http://schemas.openxmlformats.org/wordprocessingml/2006/main" xmlns:w14="http://schemas.microsoft.com/office/word/2010/wordml" xmlns:w15="http://schemas.microsoft.com/office/word/2012/wordml" xmlns:w16cex="http://schemas.microsoft.com/office/word/2018/wordml/cex" xmlns:w16cid="http://schemas.microsoft.com/office/word/2016/wordml/cid" xmlns:w16="http://schemas.microsoft.com/office/word/2018/wordml" xmlns:w16du="http://schemas.microsoft.com/office/word/2023/wordml/word16du" xmlns:w16sdtdh="http://schemas.microsoft.com/office/word/2020/wordml/sdtdatahash" xmlns:w16sdtfl="http://schemas.microsoft.com/office/word/2024/wordml/sdtformatlock" xmlns:w16se="http://schemas.microsoft.com/office/word/2015/wordml/symex" mc:Ignorable="w14 w15 w16se w16cid w16 w16cex w16sdtdh w16sdtfl w16du">
   <w:docDefaults>
     <w:rPrDefault>
       <w:rPr>
@@ -2545,7 +2609,6 @@
   <w:style w:type="character" w:default="1" w:styleId="DefaultParagraphFont">
     <w:name w:val="Default Paragraph Font"/>
     <w:uiPriority w:val="1"/>
-    <w:semiHidden/>
     <w:unhideWhenUsed/>
   </w:style>
   <w:style w:type="table" w:default="1" w:styleId="TableNormal">

</xml_diff>